<commit_message>
feat: make the LLM layer load-bearing (weekly briefing + grounding guard)
PoC: add summarize_week() — an analytical weekly procurement briefing over the
full reorder batch (triage / supplier consolidation / budget sequencing), shown
at the top of the dashboard. Add an enforced numeric-grounding guard that rejects
any LLM output containing a figure not produced by the engine and falls back to a
deterministic template. Both paths self-tested.

Docs: update proposal (MD/PPTX/PDF), Technical Overview (MD/DOCX), demo script, and
PoC README to reflect the AI now synthesising the batch (not restating one row) and
the grounding check as an enforced invariant rather than a prompt instruction.
</commit_message>
<xml_diff>
--- a/technical_overview/Atlas_Technical_Overview.docx
+++ b/technical_overview/Atlas_Technical_Overview.docx
@@ -164,7 +164,27 @@
           <w:color w:val="1F2A44"/>
           <w:sz w:val="20"/>
         </w:rPr>
-        <w:t>Atlas's procurement is reactive — SKUs are only reordered after a stockout, and hardware imports take ~2 months to arrive. This solution reads Atlas's existing ERP history, forecasts per-SKU demand over each supplier's lead time, and applies a classical reorder-point + safety-stock formula to flag which SKUs need to be ordered this week. Each flagged SKU is paired with a plain-language explanation (LLM-generated when online; deterministic template otherwise). The entire system runs on Atlas's on-prem server with no cloud dependency, matching the company's reliability and budget constraints.</w:t>
+        <w:t xml:space="preserve">Atlas's procurement is reactive — SKUs are only reordered after a stockout, and hardware imports take ~2 months to arrive. This solution reads Atlas's existing ERP history, forecasts per-SKU demand over each supplier's lead time, and applies a classical reorder-point + safety-stock formula to flag which SKUs need to be ordered this week. On top of the engine, a bounded LLM layer writes a weekly procurement briefing that </w:t>
+      </w:r>
+      <w:r>
+        <w:rPr>
+          <w:rFonts w:ascii="Calibri" w:hAnsi="Calibri"/>
+          <w:b w:val="0"/>
+          <w:i/>
+          <w:color w:val="1F2A44"/>
+          <w:sz w:val="20"/>
+        </w:rPr>
+        <w:t>triages</w:t>
+      </w:r>
+      <w:r>
+        <w:rPr>
+          <w:rFonts w:ascii="Calibri" w:hAnsi="Calibri"/>
+          <w:b w:val="0"/>
+          <w:i w:val="0"/>
+          <w:color w:val="1F2A44"/>
+          <w:sz w:val="20"/>
+        </w:rPr>
+        <w:t xml:space="preserve"> the batch (act-now / defer / consolidate by supplier, within any set budget) and a per-SKU plain-language explanation — LLM-generated when online, deterministic template otherwise, with every AI figure checked against the engine before display. The entire system runs on Atlas's on-prem server with no cloud dependency, matching the company's reliability and budget constraints.</w:t>
       </w:r>
     </w:p>
     <w:p>
@@ -423,7 +443,7 @@
                 <w:color w:val="1F2A44"/>
                 <w:sz w:val="18"/>
               </w:rPr>
-              <w:t>Plain-language explanation per recommendation</w:t>
+              <w:t>Weekly AI briefing: triage + supplier consolidation</w:t>
             </w:r>
           </w:p>
         </w:tc>
@@ -440,6 +460,36 @@
         <w:tc>
           <w:tcPr>
             <w:tcW w:type="dxa" w:w="4986"/>
+          </w:tcPr>
+          <w:p>
+            <w:r/>
+            <w:r>
+              <w:rPr>
+                <w:rFonts w:ascii="Calibri" w:hAnsi="Calibri"/>
+                <w:b w:val="0"/>
+                <w:i w:val="0"/>
+                <w:color w:val="1F2A44"/>
+                <w:sz w:val="18"/>
+              </w:rPr>
+              <w:t>Plain-language explanation per recommendation</w:t>
+            </w:r>
+          </w:p>
+        </w:tc>
+      </w:tr>
+      <w:tr>
+        <w:tc>
+          <w:tcPr>
+            <w:tcW w:type="dxa" w:w="4986"/>
+            <w:shd w:val="clear" w:color="auto" w:fill="F4F6F8"/>
+          </w:tcPr>
+          <w:p>
+            <w:r/>
+          </w:p>
+        </w:tc>
+        <w:tc>
+          <w:tcPr>
+            <w:tcW w:type="dxa" w:w="4986"/>
+            <w:shd w:val="clear" w:color="auto" w:fill="F4F6F8"/>
           </w:tcPr>
           <w:p>
             <w:r/>
@@ -927,11 +977,11 @@
         <w:br/>
         <w:t xml:space="preserve">                   Streamlit UI (local)            LLM (Claude Haiku, optional)</w:t>
         <w:br/>
-        <w:t xml:space="preserve">                   - Dashboard                     - Explanation text only</w:t>
+        <w:t xml:space="preserve">                   - Dashboard + weekly briefing   - Weekly triage briefing</w:t>
         <w:br/>
-        <w:t xml:space="preserve">                   - Drilldown                     - Template fallback if offline</w:t>
+        <w:t xml:space="preserve">                   - Drilldown                     - Per-SKU explanation</w:t>
         <w:br/>
-        <w:t xml:space="preserve">                   - What-if</w:t>
+        <w:t xml:space="preserve">                   - What-if                       - Grounding-checked; template fallback</w:t>
         <w:br/>
         <w:t xml:space="preserve">                              │</w:t>
         <w:br/>
@@ -1026,7 +1076,7 @@
           <w:color w:val="1F2A44"/>
           <w:sz w:val="20"/>
         </w:rPr>
-        <w:t>3. LLM explanation (`src/explain.py`)</w:t>
+        <w:t>3. LLM layer (`src/explain.py`)</w:t>
       </w:r>
       <w:r>
         <w:rPr>
@@ -1036,7 +1086,7 @@
           <w:color w:val="1F2A44"/>
           <w:sz w:val="20"/>
         </w:rPr>
-        <w:t xml:space="preserve"> Calls </w:t>
+        <w:t xml:space="preserve"> Two functions, both calling </w:t>
       </w:r>
       <w:r>
         <w:rPr>
@@ -1056,7 +1106,129 @@
           <w:color w:val="1F2A44"/>
           <w:sz w:val="20"/>
         </w:rPr>
-        <w:t xml:space="preserve"> with a structured prompt containing only values from the reorder engine. The system prompt forbids inventing numbers — the LLM only rephrases. Falls back to a deterministic Python template if </w:t>
+        <w:t xml:space="preserve"> with a structured payload of engine-produced values only:</w:t>
+      </w:r>
+    </w:p>
+    <w:p>
+      <w:pPr>
+        <w:pStyle w:val="ListBullet"/>
+      </w:pPr>
+      <w:r>
+        <w:rPr>
+          <w:rFonts w:ascii="Menlo" w:hAnsi="Menlo"/>
+          <w:b w:val="0"/>
+          <w:i w:val="0"/>
+          <w:color w:val="1F2A44"/>
+          <w:sz w:val="20"/>
+        </w:rPr>
+        <w:t>explain(rec)</w:t>
+      </w:r>
+      <w:r>
+        <w:rPr>
+          <w:rFonts w:ascii="Calibri" w:hAnsi="Calibri"/>
+          <w:b w:val="0"/>
+          <w:i w:val="0"/>
+          <w:color w:val="1F2A44"/>
+          <w:sz w:val="20"/>
+        </w:rPr>
+        <w:t xml:space="preserve"> — a 2–3 sentence "why" for a single recommendation.</w:t>
+      </w:r>
+    </w:p>
+    <w:p>
+      <w:pPr>
+        <w:pStyle w:val="ListBullet"/>
+      </w:pPr>
+      <w:r>
+        <w:rPr>
+          <w:rFonts w:ascii="Menlo" w:hAnsi="Menlo"/>
+          <w:b w:val="0"/>
+          <w:i w:val="0"/>
+          <w:color w:val="1F2A44"/>
+          <w:sz w:val="20"/>
+        </w:rPr>
+        <w:t>summarize_week(recs, weekly_budget)</w:t>
+      </w:r>
+      <w:r>
+        <w:rPr>
+          <w:rFonts w:ascii="Calibri" w:hAnsi="Calibri"/>
+          <w:b w:val="0"/>
+          <w:i w:val="0"/>
+          <w:color w:val="1F2A44"/>
+          <w:sz w:val="20"/>
+        </w:rPr>
+        <w:t xml:space="preserve"> — an analytical weekly briefing over the </w:t>
+      </w:r>
+      <w:r>
+        <w:rPr>
+          <w:rFonts w:ascii="Calibri" w:hAnsi="Calibri"/>
+          <w:b/>
+          <w:i w:val="0"/>
+          <w:color w:val="1F2A44"/>
+          <w:sz w:val="20"/>
+        </w:rPr>
+        <w:t>full</w:t>
+      </w:r>
+      <w:r>
+        <w:rPr>
+          <w:rFonts w:ascii="Calibri" w:hAnsi="Calibri"/>
+          <w:b w:val="0"/>
+          <w:i w:val="0"/>
+          <w:color w:val="1F2A44"/>
+          <w:sz w:val="20"/>
+        </w:rPr>
+        <w:t xml:space="preserve"> reorder batch: triage (act-now high-risk vs. defer low-risk), supplier consolidation (multiple flagged SKUs sharing a supplier → one PO), and budget sequencing. This is synthesis the deterministic engine cannot do, not a per-row restatement.</w:t>
+      </w:r>
+    </w:p>
+    <w:p>
+      <w:r>
+        <w:rPr>
+          <w:rFonts w:ascii="Calibri" w:hAnsi="Calibri"/>
+          <w:b w:val="0"/>
+          <w:i w:val="0"/>
+          <w:color w:val="1F2A44"/>
+          <w:sz w:val="20"/>
+        </w:rPr>
+        <w:t xml:space="preserve">Both are gated by a </w:t>
+      </w:r>
+      <w:r>
+        <w:rPr>
+          <w:rFonts w:ascii="Calibri" w:hAnsi="Calibri"/>
+          <w:b/>
+          <w:i w:val="0"/>
+          <w:color w:val="1F2A44"/>
+          <w:sz w:val="20"/>
+        </w:rPr>
+        <w:t>grounding guard</w:t>
+      </w:r>
+      <w:r>
+        <w:rPr>
+          <w:rFonts w:ascii="Calibri" w:hAnsi="Calibri"/>
+          <w:b w:val="0"/>
+          <w:i w:val="0"/>
+          <w:color w:val="1F2A44"/>
+          <w:sz w:val="20"/>
+        </w:rPr>
+        <w:t xml:space="preserve"> (</w:t>
+      </w:r>
+      <w:r>
+        <w:rPr>
+          <w:rFonts w:ascii="Menlo" w:hAnsi="Menlo"/>
+          <w:b w:val="0"/>
+          <w:i w:val="0"/>
+          <w:color w:val="1F2A44"/>
+          <w:sz w:val="20"/>
+        </w:rPr>
+        <w:t>numbers_are_grounded</w:t>
+      </w:r>
+      <w:r>
+        <w:rPr>
+          <w:rFonts w:ascii="Calibri" w:hAnsi="Calibri"/>
+          <w:b w:val="0"/>
+          <w:i w:val="0"/>
+          <w:color w:val="1F2A44"/>
+          <w:sz w:val="20"/>
+        </w:rPr>
+        <w:t xml:space="preserve">): every numeric token in the model's output is parsed and matched (with rounding tolerance) against the set of figures supplied to the model. If any figure cannot be traced, the LLM output is rejected and the deterministic template is returned instead — so "the LLM cannot invent numbers" is an enforced invariant, not a prompt request. Both paths fall back to template when </w:t>
       </w:r>
       <w:r>
         <w:rPr>
@@ -1076,7 +1248,7 @@
           <w:color w:val="1F2A44"/>
           <w:sz w:val="20"/>
         </w:rPr>
-        <w:t xml:space="preserve"> is unset or the network is down. UI labels each explanation's source.</w:t>
+        <w:t xml:space="preserve"> is unset or the network is down; the UI labels each output's source.</w:t>
       </w:r>
     </w:p>
     <w:p>
@@ -1123,7 +1295,7 @@
           <w:color w:val="1F2A44"/>
           <w:sz w:val="20"/>
         </w:rPr>
-        <w:t xml:space="preserve"> — KPIs, reorder queue, risk distribution</w:t>
+        <w:t xml:space="preserve"> — weekly AI briefing (triage / consolidation) at the top, then KPIs, reorder queue, risk distribution</w:t>
       </w:r>
     </w:p>
     <w:p>

</xml_diff>

<commit_message>
chore: drop internal build scripts; ship rebuilt technical-overview docx
Untrack the PDF/PPTX/DOCX build scripts (author scaffolding with undeclared
deps; nobody consuming the repo runs them) and gitignore them — kept locally.
Commit the regenerated .docx so the shipped doc reflects the Atlas rename and
the added repo/demo-video links.

Co-Authored-By: Claude Opus 4.8 (1M context) <noreply@anthropic.com>
</commit_message>
<xml_diff>
--- a/technical_overview/Atlas_Technical_Overview.docx
+++ b/technical_overview/Atlas_Technical_Overview.docx
@@ -122,6 +122,48 @@
     <w:p>
       <w:r>
         <w:rPr>
+          <w:rFonts w:ascii="Calibri" w:hAnsi="Calibri"/>
+          <w:b/>
+          <w:i w:val="0"/>
+          <w:color w:val="1F2A44"/>
+          <w:sz w:val="20"/>
+        </w:rPr>
+        <w:t>Code:</w:t>
+      </w:r>
+      <w:r>
+        <w:rPr>
+          <w:rFonts w:ascii="Calibri" w:hAnsi="Calibri"/>
+          <w:b w:val="0"/>
+          <w:i w:val="0"/>
+          <w:color w:val="1F2A44"/>
+          <w:sz w:val="20"/>
+        </w:rPr>
+        <w:t xml:space="preserve"> https://github.com/Khalifeh11/inventory-reorder-intelligence · </w:t>
+      </w:r>
+      <w:r>
+        <w:rPr>
+          <w:rFonts w:ascii="Calibri" w:hAnsi="Calibri"/>
+          <w:b/>
+          <w:i w:val="0"/>
+          <w:color w:val="1F2A44"/>
+          <w:sz w:val="20"/>
+        </w:rPr>
+        <w:t>Demo video:</w:t>
+      </w:r>
+      <w:r>
+        <w:rPr>
+          <w:rFonts w:ascii="Calibri" w:hAnsi="Calibri"/>
+          <w:b w:val="0"/>
+          <w:i w:val="0"/>
+          <w:color w:val="1F2A44"/>
+          <w:sz w:val="20"/>
+        </w:rPr>
+        <w:t xml:space="preserve"> https://www.loom.com/share/2bda04d902a24bfaafb3012acc627d61</w:t>
+      </w:r>
+    </w:p>
+    <w:p>
+      <w:r>
+        <w:rPr>
           <w:color w:val="5A6A7A"/>
           <w:sz w:val="16"/>
         </w:rPr>
@@ -184,7 +226,7 @@
           <w:color w:val="1F2A44"/>
           <w:sz w:val="20"/>
         </w:rPr>
-        <w:t xml:space="preserve"> the batch (act-now / defer / consolidate by supplier, within any set budget) and a per-SKU plain-language explanation — LLM-generated when online, deterministic template otherwise, with every AI figure checked against the engine before display. The entire system runs on Atlas's on-prem server with no cloud dependency, matching the company's reliability and budget constraints.</w:t>
+        <w:t xml:space="preserve"> the batch (act-now / defer / consolidate by supplier, within any set budget) and a per-SKU plain-language explanation — LLM-generated when online, deterministic template otherwise. The briefing is the load-bearing AI output and is gated by a numeric-grounding guard: every figure it emits is traced back to the engine before display, or the output is rejected. The entire system runs on Atlas's on-prem server with no cloud dependency, matching the company's reliability and budget constraints.</w:t>
       </w:r>
     </w:p>
     <w:p>
@@ -526,7 +568,7 @@
           <w:color w:val="1F2A44"/>
           <w:sz w:val="20"/>
         </w:rPr>
-        <w:t xml:space="preserve"> The generic input names above map to the real SECAM ERP as follows: </w:t>
+        <w:t xml:space="preserve"> The generic input names above map to the real Atlas ERP as follows: </w:t>
       </w:r>
       <w:r>
         <w:rPr>
@@ -1188,7 +1230,7 @@
           <w:color w:val="1F2A44"/>
           <w:sz w:val="20"/>
         </w:rPr>
-        <w:t xml:space="preserve">Both are gated by a </w:t>
+        <w:t xml:space="preserve">The weekly briefing is gated by a </w:t>
       </w:r>
       <w:r>
         <w:rPr>
@@ -1228,7 +1270,27 @@
           <w:color w:val="1F2A44"/>
           <w:sz w:val="20"/>
         </w:rPr>
-        <w:t xml:space="preserve">): every numeric token in the model's output is parsed and matched (with rounding tolerance) against the set of figures supplied to the model. If any figure cannot be traced, the LLM output is rejected and the deterministic template is returned instead — so "the LLM cannot invent numbers" is an enforced invariant, not a prompt request. Both paths fall back to template when </w:t>
+        <w:t xml:space="preserve">): every numeric token in the model's output is parsed and matched (with rounding tolerance) against the set of figures supplied to the model. If any figure cannot be traced, the LLM output is rejected and the deterministic template is returned instead — so "the LLM cannot invent numbers" is an enforced invariant on the briefing, not a prompt request. (Small calendar integers ≤31 — days, review cycles — are treated as linguistic and always allowed; only specific money values and quantities must trace to the engine.) The per-SKU </w:t>
+      </w:r>
+      <w:r>
+        <w:rPr>
+          <w:rFonts w:ascii="Menlo" w:hAnsi="Menlo"/>
+          <w:b w:val="0"/>
+          <w:i w:val="0"/>
+          <w:color w:val="1F2A44"/>
+          <w:sz w:val="20"/>
+        </w:rPr>
+        <w:t>explain()</w:t>
+      </w:r>
+      <w:r>
+        <w:rPr>
+          <w:rFonts w:ascii="Calibri" w:hAnsi="Calibri"/>
+          <w:b w:val="0"/>
+          <w:i w:val="0"/>
+          <w:color w:val="1F2A44"/>
+          <w:sz w:val="20"/>
+        </w:rPr>
+        <w:t xml:space="preserve"> output relies on the same numbers-only prompt but is not run through the guard, since it restates a single recommendation's own figures rather than synthesising across the batch — promoting it through the same guard is a straightforward hardening step for implementation. Both functions fall back to the template when </w:t>
       </w:r>
       <w:r>
         <w:rPr>
@@ -1248,7 +1310,47 @@
           <w:color w:val="1F2A44"/>
           <w:sz w:val="20"/>
         </w:rPr>
-        <w:t xml:space="preserve"> is unset or the network is down; the UI labels each output's source.</w:t>
+        <w:t xml:space="preserve"> is unset or the network is down; the UI labels each output's source (</w:t>
+      </w:r>
+      <w:r>
+        <w:rPr>
+          <w:rFonts w:ascii="Menlo" w:hAnsi="Menlo"/>
+          <w:b w:val="0"/>
+          <w:i w:val="0"/>
+          <w:color w:val="1F2A44"/>
+          <w:sz w:val="20"/>
+        </w:rPr>
+        <w:t>llm</w:t>
+      </w:r>
+      <w:r>
+        <w:rPr>
+          <w:rFonts w:ascii="Calibri" w:hAnsi="Calibri"/>
+          <w:b w:val="0"/>
+          <w:i w:val="0"/>
+          <w:color w:val="1F2A44"/>
+          <w:sz w:val="20"/>
+        </w:rPr>
+        <w:t xml:space="preserve"> vs. </w:t>
+      </w:r>
+      <w:r>
+        <w:rPr>
+          <w:rFonts w:ascii="Menlo" w:hAnsi="Menlo"/>
+          <w:b w:val="0"/>
+          <w:i w:val="0"/>
+          <w:color w:val="1F2A44"/>
+          <w:sz w:val="20"/>
+        </w:rPr>
+        <w:t>template</w:t>
+      </w:r>
+      <w:r>
+        <w:rPr>
+          <w:rFonts w:ascii="Calibri" w:hAnsi="Calibri"/>
+          <w:b w:val="0"/>
+          <w:i w:val="0"/>
+          <w:color w:val="1F2A44"/>
+          <w:sz w:val="20"/>
+        </w:rPr>
+        <w:t>).</w:t>
       </w:r>
     </w:p>
     <w:p>
@@ -1320,7 +1422,7 @@
           <w:color w:val="1F2A44"/>
           <w:sz w:val="20"/>
         </w:rPr>
-        <w:t xml:space="preserve"> — per-SKU 10-year chart + 3-month forecast + full recommendation + explanation</w:t>
+        <w:t xml:space="preserve"> — per-SKU monthly sales chart (18-month trailing window) + 6-month forward forecast + full recommendation + explanation + 12-month backtest (MAPE)</w:t>
       </w:r>
     </w:p>
     <w:p>
@@ -1388,7 +1490,7 @@
           <w:color w:val="1F2A44"/>
           <w:sz w:val="20"/>
         </w:rPr>
-        <w:t xml:space="preserve">Optional: </w:t>
+        <w:t xml:space="preserve">Optional, to enable the LLM path: put </w:t>
       </w:r>
       <w:r>
         <w:rPr>
@@ -1398,7 +1500,7 @@
           <w:color w:val="1F2A44"/>
           <w:sz w:val="20"/>
         </w:rPr>
-        <w:t>export ANTHROPIC_API_KEY=sk-ant-...</w:t>
+        <w:t>ANTHROPIC_API_KEY=sk-ant-...</w:t>
       </w:r>
       <w:r>
         <w:rPr>
@@ -1408,7 +1510,107 @@
           <w:color w:val="1F2A44"/>
           <w:sz w:val="20"/>
         </w:rPr>
-        <w:t xml:space="preserve"> before launching to enable LLM explanations.</w:t>
+        <w:t xml:space="preserve"> in </w:t>
+      </w:r>
+      <w:r>
+        <w:rPr>
+          <w:rFonts w:ascii="Menlo" w:hAnsi="Menlo"/>
+          <w:b w:val="0"/>
+          <w:i w:val="0"/>
+          <w:color w:val="1F2A44"/>
+          <w:sz w:val="20"/>
+        </w:rPr>
+        <w:t>poc/.env</w:t>
+      </w:r>
+      <w:r>
+        <w:rPr>
+          <w:rFonts w:ascii="Calibri" w:hAnsi="Calibri"/>
+          <w:b w:val="0"/>
+          <w:i w:val="0"/>
+          <w:color w:val="1F2A44"/>
+          <w:sz w:val="20"/>
+        </w:rPr>
+        <w:t xml:space="preserve"> (auto-loaded via </w:t>
+      </w:r>
+      <w:r>
+        <w:rPr>
+          <w:rFonts w:ascii="Menlo" w:hAnsi="Menlo"/>
+          <w:b w:val="0"/>
+          <w:i w:val="0"/>
+          <w:color w:val="1F2A44"/>
+          <w:sz w:val="20"/>
+        </w:rPr>
+        <w:t>python-dotenv</w:t>
+      </w:r>
+      <w:r>
+        <w:rPr>
+          <w:rFonts w:ascii="Calibri" w:hAnsi="Calibri"/>
+          <w:b w:val="0"/>
+          <w:i w:val="0"/>
+          <w:color w:val="1F2A44"/>
+          <w:sz w:val="20"/>
+        </w:rPr>
+        <w:t xml:space="preserve">) or export it before launching. Launch with the project interpreter (e.g. </w:t>
+      </w:r>
+      <w:r>
+        <w:rPr>
+          <w:rFonts w:ascii="Menlo" w:hAnsi="Menlo"/>
+          <w:b w:val="0"/>
+          <w:i w:val="0"/>
+          <w:color w:val="1F2A44"/>
+          <w:sz w:val="20"/>
+        </w:rPr>
+        <w:t>.venv/bin/streamlit run app.py</w:t>
+      </w:r>
+      <w:r>
+        <w:rPr>
+          <w:rFonts w:ascii="Calibri" w:hAnsi="Calibri"/>
+          <w:b w:val="0"/>
+          <w:i w:val="0"/>
+          <w:color w:val="1F2A44"/>
+          <w:sz w:val="20"/>
+        </w:rPr>
+        <w:t xml:space="preserve"> from inside </w:t>
+      </w:r>
+      <w:r>
+        <w:rPr>
+          <w:rFonts w:ascii="Menlo" w:hAnsi="Menlo"/>
+          <w:b w:val="0"/>
+          <w:i w:val="0"/>
+          <w:color w:val="1F2A44"/>
+          <w:sz w:val="20"/>
+        </w:rPr>
+        <w:t>poc/</w:t>
+      </w:r>
+      <w:r>
+        <w:rPr>
+          <w:rFonts w:ascii="Calibri" w:hAnsi="Calibri"/>
+          <w:b w:val="0"/>
+          <w:i w:val="0"/>
+          <w:color w:val="1F2A44"/>
+          <w:sz w:val="20"/>
+        </w:rPr>
+        <w:t xml:space="preserve">) so </w:t>
+      </w:r>
+      <w:r>
+        <w:rPr>
+          <w:rFonts w:ascii="Menlo" w:hAnsi="Menlo"/>
+          <w:b w:val="0"/>
+          <w:i w:val="0"/>
+          <w:color w:val="1F2A44"/>
+          <w:sz w:val="20"/>
+        </w:rPr>
+        <w:t>.env</w:t>
+      </w:r>
+      <w:r>
+        <w:rPr>
+          <w:rFonts w:ascii="Calibri" w:hAnsi="Calibri"/>
+          <w:b w:val="0"/>
+          <w:i w:val="0"/>
+          <w:color w:val="1F2A44"/>
+          <w:sz w:val="20"/>
+        </w:rPr>
+        <w:t xml:space="preserve"> is loaded — otherwise the app runs but silently falls back to the offline template, which the sidebar will flag.</w:t>
       </w:r>
     </w:p>
     <w:p>

</xml_diff>